<commit_message>
Refine internal disposition table per GPT v2 feedback
- Top-line reframed: C (BNBL-controlled platform) is the TARGET direction, not yet a completed doc structure; platform economics to be built out in later redline after principles locked
- Add explicit sequencing (lock principles -> Zoom -> redline -> counsel); note only factual-accuracy edits made so far
- Add Terminology guardrail: avoid 'exclusive Field/Territory'/'full U.S. exclusivity' as anchor; use product/project/partner/milestone-specific limited exclusivity + ROFN; 'commercially workable' externally
- Tighten minority (price anti-dilution = Series A investor term), improvements (arm's-length license-back, TP review), non-compete reconciliation wording

https://claude.ai/code/session_01SkX9Nkj6o3KuWJL6HpkMeT
</commit_message>
<xml_diff>
--- a/JK_Comments_Disposition_INTERNAL.docx
+++ b/JK_Comments_Disposition_INTERNAL.docx
@@ -41,7 +41,7 @@
           <w:b/>
           <w:i w:val="0"/>
         </w:rPr>
-        <w:t>NewCo should have meaningful commercial rights and investor-readable protections within BNBL-approved products / projects in the U.S., but BNBL must retain ownership and global control over HME-DDS™ Background IP and core Technical Improvements.</w:t>
+        <w:t>BNBL's position is to build NewCo as a BNBL-controlled U.S. commercialization platform — not merely a sales agent, and not an independent owner of BNBL's core HME-DDS™ technology. NewCo should receive meaningful commercial rights, commercially workable protections, and economic upside within BNBL-approved products, partners, and projects in the U.S., while BNBL retains ownership and global control over HME-DDS™ Background IP and core Technical Improvements.</w:t>
       </w:r>
     </w:p>
     <w:p>
@@ -51,7 +51,17 @@
           <w:i/>
           <w:color w:val="555555"/>
         </w:rPr>
-        <w:t>Strategy: HYBRID (staged). Stage 1 = BNBL-controlled U.S. commercialization platform (non-exclusive, BNBL-approved scope). Stage 2 = on agreed milestones, grant project/product-level limited exclusivity / ROFN, license-back of NewCo-funded improvements, and cleaner minority terms ahead of any Series A.</w:t>
+        <w:t>Status note: this is the TARGET direction, not yet a completed document structure. The current SHA v2 / IP License remain protection-centric (closer to a BNBL arm) with some platform elements; the platform economics (project-level limited exclusivity / ROFN, improvement license-back / compensation, defined commercial upside, objective milestones) are to be BUILT OUT in a later redline AFTER the principles below are locked and aligned in a 3-party call. The only edits made so far are factual-accuracy corrections to the Redline Summary — NO operative position has been changed.</w:t>
+      </w:r>
+    </w:p>
+    <w:p>
+      <w:r>
+        <w:rPr>
+          <w:b w:val="0"/>
+          <w:i/>
+          <w:color w:val="555555"/>
+        </w:rPr>
+        <w:t>Sequencing: (1) lock this disposition + 5 principles  -&gt;  (2) 3-party Zoom alignment  -&gt;  (3) SHA / IP License redline  -&gt;  (4) U.S. counsel review. Do not redline the operative SHA / IP License before step 2.</w:t>
       </w:r>
     </w:p>
     <w:p>
@@ -62,6 +72,35 @@
           <w:color w:val="555555"/>
         </w:rPr>
         <w:t>Legend:  A = Accept (low cost / good governance)   |   B = Conditional / negotiate (staged)   |   C = Hold (BNBL core, not conceded)</w:t>
+      </w:r>
+    </w:p>
+    <w:p>
+      <w:r>
+        <w:rPr>
+          <w:b/>
+          <w:sz w:val="21"/>
+        </w:rPr>
+        <w:t>Terminology guardrail (apply in ALL counsel-facing and external drafts)</w:t>
+      </w:r>
+    </w:p>
+    <w:p>
+      <w:r>
+        <w:rPr>
+          <w:b w:val="0"/>
+          <w:i w:val="0"/>
+          <w:color w:val="C00000"/>
+        </w:rPr>
+        <w:t>AVOID as a starting point: 'exclusive Field/Territory', 'full U.S. exclusivity', 'all U.S. HME-DDS rights'. These can become counsel's drafting anchor and push the documents NewCo-ward.</w:t>
+      </w:r>
+    </w:p>
+    <w:p>
+      <w:r>
+        <w:rPr>
+          <w:b w:val="0"/>
+          <w:i w:val="0"/>
+          <w:color w:val="1E7A34"/>
+        </w:rPr>
+        <w:t>USE instead: 'product-specific limited exclusivity', 'project-specific commercial protection', 'partner-specific exclusivity', 'milestone-based continuation', and (most freely) 'right of first negotiation (ROFN)'. Externally prefer 'commercially workable protections' over 'investor-readable protections'.</w:t>
       </w:r>
     </w:p>
     <w:p>
@@ -133,7 +172,7 @@
               <w:rPr>
                 <w:color w:val="555555"/>
               </w:rPr>
-              <w:t>ALREADY IN SHA v2: pro-rata (2.3, 2.4(b)), ROFR (6.2), tag-along (6.3), drag-along (6.4). PRICE-BASED anti-dilution NOT present — but that is normally a Series A investor term, not a founder term (not needed now).</w:t>
+              <w:t>Pro-rata participation, ROFR, tag-along and drag-along are ALREADY included in SHA v2 (2.3, 2.4(b), 6.2, 6.3, 6.4). Price-based anti-dilution is NOT included and is generally a Series A investor term, not a founder-level right at this stage.</w:t>
             </w:r>
           </w:p>
         </w:tc>
@@ -159,7 +198,7 @@
           </w:tcPr>
           <w:p>
             <w:r>
-              <w:t>Confirm existing minority terms to counsel; add explicit pre-emptive wording if counsel wants. KEEP 51% consent right (C); confirm wording already allows an A-approved Series A to proceed (5.2/2.4(a) already drafted that way).</w:t>
+              <w:t>U.S. counsel to confirm whether the existing wording is sufficient (add explicit pre-emptive wording only if counsel wants). KEEP the 51% consent right (C); confirm the wording already allows an A-approved Series A to proceed (5.2 / 2.4(a) drafted that way).</w:t>
             </w:r>
           </w:p>
         </w:tc>
@@ -281,7 +320,7 @@
           </w:tcPr>
           <w:p>
             <w:r>
-              <w:t>A: carve out sublicensing to BNBL-approved distributors/CMOs; add Bankruptcy Code Sec. 365(n) licensee protection. B (Stage 2): project/product-level limited exclusivity or ROFN, milestone-based. C: Background IP ownership stays at BNBL; termination keeps core triggers (unapproved cap-table change, unauthorized use, IP challenge) — may narrow the 'ordinary investor round' edge case at Stage 2. Internal: avoid blanket 'exclusive U.S. Field'.</w:t>
+              <w:t>A: carve out sublicensing to BNBL-approved distributors/CMOs; add Bankruptcy Code Sec. 365(n) licensee protection. B (Stage 2): product/project-specific limited exclusivity or ROFN, milestone-based — NOT full Field/Territory exclusivity. C: Background IP ownership stays at BNBL; termination keeps core triggers (unapproved cap-table change, unauthorized use, IP challenge) — may narrow the 'ordinary investor round' edge case at Stage 2.</w:t>
             </w:r>
           </w:p>
         </w:tc>
@@ -403,7 +442,7 @@
           </w:tcPr>
           <w:p>
             <w:r>
-              <w:t>C: Technical Improvements baseline ownership stays BNBL. B: grant NewCo exclusive/semi-exclusive Field license-back to improvements IT funds + economic comp (royalty credit / cost-share / milestone participation); NARROW 'Improvements' def to genuinely Background-IP-derived. A: add no-sharing-with-competitors carve-out + purpose/confidentiality limits + customer-data privacy compliance on Commercial Data.</w:t>
+              <w:t>C: Technical Improvements remain owned by BNBL. B: if NewCo materially funds development, grant a field/project-limited license-back + arm's-length economic participation (royalty credit / cost-share / milestone participation), subject to transfer-pricing review; NARROW 'Improvements' def to genuinely Background-IP-derived. A: add no-sharing-with-competitors carve-out + purpose/confidentiality limits + customer-data privacy compliance on Commercial Data.</w:t>
             </w:r>
           </w:p>
         </w:tc>
@@ -525,7 +564,7 @@
           </w:tcPr>
           <w:p>
             <w:r>
-              <w:t>A: make non-circumvention / non-solicitation MUTUAL; confirm consideration + Nevada enforceability with counsel. B: reconcile A's licensing carve-out vs any Stage-2 exclusivity (within an exclusive field, A's freedom is bounded). C: BNBL/affiliates keep general freedom OUTSIDE any granted exclusive field + global business.</w:t>
+              <w:t>A: make non-circumvention / non-solicitation MUTUAL; confirm consideration + Nevada enforceability with counsel. B: reconcile A's licensing carve-out vs any Stage-2 protection (within any product/project-specific protection granted to NewCo, A's competing/licensing freedom is correspondingly bounded). C: BNBL/affiliates keep general freedom OUTSIDE any granted protection + global business.</w:t>
             </w:r>
           </w:p>
         </w:tc>

</xml_diff>